<commit_message>
Add conversational agents learning materials
</commit_message>
<xml_diff>
--- a/public/notes/posts/LINKEDIN_POST.docx
+++ b/public/notes/posts/LINKEDIN_POST.docx
@@ -41,7 +41,7 @@
         <w:rPr>
           <w:sz w:val="22"/>
         </w:rPr>
-        <w:t>207 test cases generated. $0.48 in LLM costs. 92% less time.</w:t>
+        <w:t>870 test cases generated. $1.74 in LLM costs. 92% less time.</w:t>
       </w:r>
     </w:p>
     <w:p>
@@ -132,7 +132,7 @@
         <w:rPr>
           <w:sz w:val="22"/>
         </w:rPr>
-        <w:t xml:space="preserve">   207 test cases generated and uploaded via ai-test-gen</w:t>
+        <w:t xml:space="preserve">   870 test cases generated and uploaded via ai-test-gen</w:t>
       </w:r>
     </w:p>
     <w:p>
@@ -143,7 +143,7 @@
         <w:rPr>
           <w:sz w:val="22"/>
         </w:rPr>
-        <w:t xml:space="preserve">   870 total test cases now live in ADO (AI-generated + manually authored)</w:t>
+        <w:t xml:space="preserve">   49 stories with full test coverage in ADO (89%)</w:t>
       </w:r>
     </w:p>
     <w:p>
@@ -240,7 +240,7 @@
         <w:rPr>
           <w:sz w:val="22"/>
         </w:rPr>
-        <w:t>The LLM cost for the entire project? $2.20.</w:t>
+        <w:t>The LLM cost for the entire project? $1.74.</w:t>
       </w:r>
     </w:p>
     <w:p>

</xml_diff>